<commit_message>
Professional Record: Words to Stand On as a cream/gold panel
Restyle the Words to Stand On block on the Professional Record first page as a
calm cream panel with a gold left border, a gold uppercase label with the book
icon, and serif italic navy affirmations, matching the handbook's treatment.
Only this page changed; all other pages, files, content, and fields are
unchanged. Not pushed.

Co-Authored-By: Claude Opus 4.8 <noreply@anthropic.com>
Claude-Session: https://claude.ai/code/session_01ToTykVvAYrMhrswtJBy37S
</commit_message>
<xml_diff>
--- a/_build/keep-the-proof-v2/production/bundle/03_YOUR_PROFESSIONAL_RECORD.docx
+++ b/_build/keep-the-proof-v2/production/bundle/03_YOUR_PROFESSIONAL_RECORD.docx
@@ -291,184 +291,214 @@
     </w:p>
     <w:p>
       <w:pPr>
-        <w:keepNext/>
-        <w:spacing w:before="200" w:after="60"/>
-      </w:pPr>
-      <w:r>
-        <w:drawing>
-          <wp:inline xmlns:a="http://schemas.openxmlformats.org/drawingml/2006/main" xmlns:pic="http://schemas.openxmlformats.org/drawingml/2006/picture">
-            <wp:extent cx="128016" cy="128016"/>
-            <wp:docPr id="2" name="Picture 2" descr="Words to Stand On" title="Words to Stand On"/>
-            <wp:cNvGraphicFramePr>
-              <a:graphicFrameLocks noChangeAspect="1"/>
-            </wp:cNvGraphicFramePr>
-            <a:graphic>
-              <a:graphicData uri="http://schemas.openxmlformats.org/drawingml/2006/picture">
-                <pic:pic>
-                  <pic:nvPicPr>
-                    <pic:cNvPr id="0" name="words.png"/>
-                    <pic:cNvPicPr/>
-                  </pic:nvPicPr>
-                  <pic:blipFill>
-                    <a:blip r:embed="rId10"/>
-                    <a:stretch>
-                      <a:fillRect/>
-                    </a:stretch>
-                  </pic:blipFill>
-                  <pic:spPr>
-                    <a:xfrm>
-                      <a:off x="0" y="0"/>
-                      <a:ext cx="128016" cy="128016"/>
-                    </a:xfrm>
-                    <a:prstGeom prst="rect"/>
-                  </pic:spPr>
-                </pic:pic>
-              </a:graphicData>
-            </a:graphic>
-          </wp:inline>
-        </w:drawing>
-      </w:r>
-      <w:r>
-        <w:rPr>
-          <w:sz w:val="22"/>
-        </w:rPr>
-        <w:t xml:space="preserve">  </w:t>
-      </w:r>
-      <w:r>
-        <w:rPr>
-          <w:b/>
-          <w:color w:val="112345"/>
-          <w:sz w:val="20"/>
-        </w:rPr>
-        <w:t>Words to Stand On</w:t>
-      </w:r>
-    </w:p>
-    <w:p>
-      <w:pPr>
-        <w:spacing w:after="60" w:before="0"/>
-      </w:pPr>
-      <w:r>
-        <w:rPr>
-          <w:b w:val="0"/>
-          <w:i/>
-          <w:color w:val="6B707D"/>
-          <w:sz w:val="17"/>
-        </w:rPr>
-        <w:t>Read these slowly before each session with your record. Every line is true for you today, and the rest of the system helps you prove it.</w:t>
-      </w:r>
-    </w:p>
-    <w:p>
-      <w:pPr>
-        <w:spacing w:after="60" w:before="0"/>
-        <w:ind w:left="259"/>
-      </w:pPr>
-      <w:r>
-        <w:rPr>
-          <w:b w:val="0"/>
-          <w:i/>
-          <w:color w:val="112345"/>
-          <w:sz w:val="21"/>
-        </w:rPr>
-        <w:t>I have done work that mattered, and I can name it.</w:t>
-      </w:r>
-    </w:p>
-    <w:p>
-      <w:pPr>
-        <w:spacing w:after="60" w:before="0"/>
-        <w:ind w:left="259"/>
-      </w:pPr>
-      <w:r>
-        <w:rPr>
-          <w:b w:val="0"/>
-          <w:i/>
-          <w:color w:val="112345"/>
-          <w:sz w:val="21"/>
-        </w:rPr>
-        <w:t>What I built did not leave when the job did.</w:t>
-      </w:r>
-    </w:p>
-    <w:p>
-      <w:pPr>
-        <w:spacing w:after="60" w:before="0"/>
-        <w:ind w:left="259"/>
-      </w:pPr>
-      <w:r>
-        <w:rPr>
-          <w:b w:val="0"/>
-          <w:i/>
-          <w:color w:val="112345"/>
-          <w:sz w:val="21"/>
-        </w:rPr>
-        <w:t>I can be experienced and new at the same time.</w:t>
-      </w:r>
-    </w:p>
-    <w:p>
-      <w:pPr>
-        <w:spacing w:after="60" w:before="0"/>
-        <w:ind w:left="259"/>
-      </w:pPr>
-      <w:r>
-        <w:rPr>
-          <w:b w:val="0"/>
-          <w:i/>
-          <w:color w:val="112345"/>
-          <w:sz w:val="21"/>
-        </w:rPr>
-        <w:t>I can learn what the next place requires.</w:t>
-      </w:r>
-    </w:p>
-    <w:p>
-      <w:pPr>
-        <w:spacing w:after="60" w:before="0"/>
-        <w:ind w:left="259"/>
-      </w:pPr>
-      <w:r>
-        <w:rPr>
-          <w:b w:val="0"/>
-          <w:i/>
-          <w:color w:val="112345"/>
-          <w:sz w:val="21"/>
-        </w:rPr>
-        <w:t>I will tell the truth about my work, without shrinking it and without inflating it.</w:t>
-      </w:r>
-    </w:p>
-    <w:p>
-      <w:pPr>
-        <w:spacing w:after="60" w:before="0"/>
-        <w:ind w:left="259"/>
-      </w:pPr>
-      <w:r>
-        <w:rPr>
-          <w:b w:val="0"/>
-          <w:i/>
-          <w:color w:val="112345"/>
-          <w:sz w:val="21"/>
-        </w:rPr>
-        <w:t>I can carry hope and uncertainty in the same week.</w:t>
-      </w:r>
-    </w:p>
-    <w:p>
-      <w:pPr>
-        <w:spacing w:after="20" w:before="60"/>
-      </w:pPr>
-      <w:r>
-        <w:rPr>
-          <w:b/>
-          <w:i w:val="0"/>
-          <w:color w:val="112345"/>
-          <w:sz w:val="20"/>
-        </w:rPr>
-        <w:t>One thing I did that someone relied on:</w:t>
-      </w:r>
-    </w:p>
-    <w:p>
-      <w:pPr>
-        <w:spacing w:before="200"/>
-        <w:pBdr>
-          <w:bottom w:val="single" w:sz="4" w:space="2" w:color="C9C4B7"/>
-        </w:pBdr>
-      </w:pPr>
-    </w:p>
+        <w:spacing w:after="40" w:before="0"/>
+      </w:pPr>
+    </w:p>
+    <w:tbl>
+      <w:tblPr>
+        <w:tblW w:type="auto" w:w="0"/>
+        <w:tblLook w:firstColumn="1" w:firstRow="1" w:lastColumn="0" w:lastRow="0" w:noHBand="0" w:noVBand="1" w:val="04A0"/>
+      </w:tblPr>
+      <w:tblGrid>
+        <w:gridCol w:w="9360"/>
+      </w:tblGrid>
+      <w:tr>
+        <w:tc>
+          <w:tcPr>
+            <w:tcW w:type="dxa" w:w="9360"/>
+            <w:shd w:val="clear" w:color="auto" w:fill="F5F1E8"/>
+            <w:tcBorders>
+              <w:top w:val="single" w:sz="4" w:space="0" w:color="E0D7C4"/>
+              <w:left w:val="single" w:sz="24" w:space="0" w:color="C9A84C"/>
+              <w:bottom w:val="single" w:sz="4" w:space="0" w:color="E0D7C4"/>
+              <w:right w:val="single" w:sz="4" w:space="0" w:color="E0D7C4"/>
+            </w:tcBorders>
+          </w:tcPr>
+          <w:p>
+            <w:pPr>
+              <w:spacing w:before="120" w:after="100"/>
+              <w:ind w:left="144" w:right="115"/>
+            </w:pPr>
+            <w:r>
+              <w:drawing>
+                <wp:inline xmlns:a="http://schemas.openxmlformats.org/drawingml/2006/main" xmlns:pic="http://schemas.openxmlformats.org/drawingml/2006/picture">
+                  <wp:extent cx="128016" cy="128016"/>
+                  <wp:docPr id="2" name="Picture 2" descr="Words to Stand On" title="Words to Stand On"/>
+                  <wp:cNvGraphicFramePr>
+                    <a:graphicFrameLocks noChangeAspect="1"/>
+                  </wp:cNvGraphicFramePr>
+                  <a:graphic>
+                    <a:graphicData uri="http://schemas.openxmlformats.org/drawingml/2006/picture">
+                      <pic:pic>
+                        <pic:nvPicPr>
+                          <pic:cNvPr id="0" name="words.png"/>
+                          <pic:cNvPicPr/>
+                        </pic:nvPicPr>
+                        <pic:blipFill>
+                          <a:blip r:embed="rId10"/>
+                          <a:stretch>
+                            <a:fillRect/>
+                          </a:stretch>
+                        </pic:blipFill>
+                        <pic:spPr>
+                          <a:xfrm>
+                            <a:off x="0" y="0"/>
+                            <a:ext cx="128016" cy="128016"/>
+                          </a:xfrm>
+                          <a:prstGeom prst="rect"/>
+                        </pic:spPr>
+                      </pic:pic>
+                    </a:graphicData>
+                  </a:graphic>
+                </wp:inline>
+              </w:drawing>
+            </w:r>
+            <w:r>
+              <w:rPr>
+                <w:sz w:val="22"/>
+              </w:rPr>
+              <w:t xml:space="preserve">  </w:t>
+            </w:r>
+            <w:r>
+              <w:rPr>
+                <w:rFonts w:ascii="Calibri" w:hAnsi="Calibri"/>
+                <w:b/>
+                <w:color w:val="A8862E"/>
+                <w:sz w:val="18"/>
+              </w:rPr>
+              <w:t>WORDS TO STAND ON</w:t>
+            </w:r>
+          </w:p>
+          <w:p>
+            <w:pPr>
+              <w:spacing w:before="0" w:after="120"/>
+              <w:ind w:left="144" w:right="115"/>
+            </w:pPr>
+            <w:r>
+              <w:rPr>
+                <w:i/>
+                <w:color w:val="6B707D"/>
+                <w:sz w:val="17"/>
+              </w:rPr>
+              <w:t>Read these slowly before each session with your record. Every line is true for you today, and the rest of the system helps you prove it.</w:t>
+            </w:r>
+          </w:p>
+          <w:p>
+            <w:pPr>
+              <w:spacing w:before="0" w:after="100"/>
+              <w:ind w:left="144" w:right="115"/>
+            </w:pPr>
+            <w:r>
+              <w:rPr>
+                <w:rFonts w:ascii="Cambria" w:hAnsi="Cambria"/>
+                <w:i/>
+                <w:color w:val="112345"/>
+                <w:sz w:val="24"/>
+              </w:rPr>
+              <w:t>I have done work that mattered, and I can name it.</w:t>
+            </w:r>
+          </w:p>
+          <w:p>
+            <w:pPr>
+              <w:spacing w:before="0" w:after="100"/>
+              <w:ind w:left="144" w:right="115"/>
+            </w:pPr>
+            <w:r>
+              <w:rPr>
+                <w:rFonts w:ascii="Cambria" w:hAnsi="Cambria"/>
+                <w:i/>
+                <w:color w:val="112345"/>
+                <w:sz w:val="24"/>
+              </w:rPr>
+              <w:t>What I built did not leave when the job did.</w:t>
+            </w:r>
+          </w:p>
+          <w:p>
+            <w:pPr>
+              <w:spacing w:before="0" w:after="100"/>
+              <w:ind w:left="144" w:right="115"/>
+            </w:pPr>
+            <w:r>
+              <w:rPr>
+                <w:rFonts w:ascii="Cambria" w:hAnsi="Cambria"/>
+                <w:i/>
+                <w:color w:val="112345"/>
+                <w:sz w:val="24"/>
+              </w:rPr>
+              <w:t>I can be experienced and new at the same time.</w:t>
+            </w:r>
+          </w:p>
+          <w:p>
+            <w:pPr>
+              <w:spacing w:before="0" w:after="100"/>
+              <w:ind w:left="144" w:right="115"/>
+            </w:pPr>
+            <w:r>
+              <w:rPr>
+                <w:rFonts w:ascii="Cambria" w:hAnsi="Cambria"/>
+                <w:i/>
+                <w:color w:val="112345"/>
+                <w:sz w:val="24"/>
+              </w:rPr>
+              <w:t>I can learn what the next place requires.</w:t>
+            </w:r>
+          </w:p>
+          <w:p>
+            <w:pPr>
+              <w:spacing w:before="0" w:after="100"/>
+              <w:ind w:left="144" w:right="115"/>
+            </w:pPr>
+            <w:r>
+              <w:rPr>
+                <w:rFonts w:ascii="Cambria" w:hAnsi="Cambria"/>
+                <w:i/>
+                <w:color w:val="112345"/>
+                <w:sz w:val="24"/>
+              </w:rPr>
+              <w:t>I will tell the truth about my work, without shrinking it and without inflating it.</w:t>
+            </w:r>
+          </w:p>
+          <w:p>
+            <w:pPr>
+              <w:spacing w:before="0" w:after="100"/>
+              <w:ind w:left="144" w:right="115"/>
+            </w:pPr>
+            <w:r>
+              <w:rPr>
+                <w:rFonts w:ascii="Cambria" w:hAnsi="Cambria"/>
+                <w:i/>
+                <w:color w:val="112345"/>
+                <w:sz w:val="24"/>
+              </w:rPr>
+              <w:t>I can carry hope and uncertainty in the same week.</w:t>
+            </w:r>
+          </w:p>
+          <w:p>
+            <w:pPr>
+              <w:spacing w:before="80" w:after="40"/>
+              <w:ind w:left="144" w:right="115"/>
+            </w:pPr>
+            <w:r>
+              <w:rPr>
+                <w:b/>
+                <w:color w:val="112345"/>
+                <w:sz w:val="20"/>
+              </w:rPr>
+              <w:t>One thing I did that someone relied on:</w:t>
+            </w:r>
+          </w:p>
+          <w:p>
+            <w:pPr>
+              <w:spacing w:before="40" w:after="120"/>
+              <w:ind w:left="144" w:right="115"/>
+              <w:pBdr>
+                <w:bottom w:val="single" w:sz="4" w:space="2" w:color="C9A84C"/>
+              </w:pBdr>
+            </w:pPr>
+          </w:p>
+        </w:tc>
+      </w:tr>
+    </w:tbl>
     <w:p>
       <w:pPr>
         <w:spacing w:before="120" w:after="120"/>

</xml_diff>